<commit_message>
Completed the Fourth Question. Trying to make a dashboard.
</commit_message>
<xml_diff>
--- a/docs/trash_haulers_claude_Q&A.docx
+++ b/docs/trash_haulers_claude_Q&A.docx
@@ -5,58 +5,57 @@
   <w:body>
     <w:p>
       <w:pPr>
+        <w:ind w:left="0" w:firstLine="0"/>
+        <w:rPr>
+          <w:rFonts w:ascii="Times New Roman" w:cs="Times New Roman" w:eastAsia="Times New Roman" w:hAnsi="Times New Roman"/>
+          <w:b w:val="1"/>
+          <w:bCs w:val="1"/>
+          <w:sz w:val="24"/>
+          <w:szCs w:val="24"/>
+        </w:rPr>
+      </w:pPr>
+      <w:r>
+        <w:rPr>
+          <w:rFonts w:ascii="Times New Roman" w:cs="Times New Roman" w:eastAsia="Times New Roman" w:hAnsi="Times New Roman"/>
+          <w:b w:val="1"/>
+          <w:bCs w:val="1"/>
+          <w:sz w:val="24"/>
+          <w:szCs w:val="24"/>
+          <w:rtl w:val="0"/>
+        </w:rPr>
+        <w:t xml:space="preserve">Q: Explain this spreadsheet to me</w:t>
+      </w:r>
+    </w:p>
+    <w:p>
+      <w:pPr>
         <w:ind w:left="720" w:firstLine="0"/>
         <w:rPr>
           <w:rFonts w:ascii="Times New Roman" w:cs="Times New Roman" w:eastAsia="Times New Roman" w:hAnsi="Times New Roman"/>
-          <w:b w:val="1"/>
-          <w:bCs w:val="1"/>
-          <w:sz w:val="24"/>
-          <w:szCs w:val="24"/>
-        </w:rPr>
-      </w:pPr>
-      <w:r>
-        <w:rPr>
-          <w:rFonts w:ascii="Times New Roman" w:cs="Times New Roman" w:eastAsia="Times New Roman" w:hAnsi="Times New Roman"/>
-          <w:b w:val="1"/>
-          <w:bCs w:val="1"/>
-          <w:sz w:val="24"/>
-          <w:szCs w:val="24"/>
-          <w:rtl w:val="0"/>
-        </w:rPr>
-        <w:t xml:space="preserve">Q: Explain this spreadsheet to me</w:t>
-      </w:r>
-    </w:p>
-    <w:p>
-      <w:pPr>
-        <w:ind w:left="720" w:firstLine="0"/>
-        <w:rPr>
-          <w:rFonts w:ascii="Times New Roman" w:cs="Times New Roman" w:eastAsia="Times New Roman" w:hAnsi="Times New Roman"/>
-          <w:sz w:val="24"/>
-          <w:szCs w:val="24"/>
-        </w:rPr>
-      </w:pPr>
-      <w:r>
-        <w:rPr>
-          <w:rtl w:val="0"/>
-        </w:rPr>
-      </w:r>
-    </w:p>
-    <w:p>
-      <w:pPr>
-        <w:rPr>
-          <w:rFonts w:ascii="Times New Roman" w:cs="Times New Roman" w:eastAsia="Times New Roman" w:hAnsi="Times New Roman"/>
-          <w:sz w:val="24"/>
-          <w:szCs w:val="24"/>
-        </w:rPr>
-      </w:pPr>
-      <w:r>
-        <w:rPr>
-          <w:rFonts w:ascii="Times New Roman" w:cs="Times New Roman" w:eastAsia="Times New Roman" w:hAnsi="Times New Roman"/>
-          <w:sz w:val="24"/>
-          <w:szCs w:val="24"/>
-          <w:rtl w:val="0"/>
-        </w:rPr>
-        <w:tab/>
+          <w:sz w:val="24"/>
+          <w:szCs w:val="24"/>
+        </w:rPr>
+      </w:pPr>
+      <w:r>
+        <w:rPr>
+          <w:rtl w:val="0"/>
+        </w:rPr>
+      </w:r>
+    </w:p>
+    <w:p>
+      <w:pPr>
+        <w:rPr>
+          <w:rFonts w:ascii="Times New Roman" w:cs="Times New Roman" w:eastAsia="Times New Roman" w:hAnsi="Times New Roman"/>
+          <w:sz w:val="24"/>
+          <w:szCs w:val="24"/>
+        </w:rPr>
+      </w:pPr>
+      <w:r>
+        <w:rPr>
+          <w:rFonts w:ascii="Times New Roman" w:cs="Times New Roman" w:eastAsia="Times New Roman" w:hAnsi="Times New Roman"/>
+          <w:sz w:val="24"/>
+          <w:szCs w:val="24"/>
+          <w:rtl w:val="0"/>
+        </w:rPr>
         <w:t xml:space="preserve">A: This is a service request log for residential trash collection — looks like Metro Nashville (zip codes 372xx, references to council districts and haulers like Red River, Waste Industries, Metro). 20,226 rows of complaints/tickets, each geocoded.</w:t>
       </w:r>
     </w:p>
@@ -424,7 +423,6 @@
           <w:szCs w:val="24"/>
           <w:rtl w:val="0"/>
         </w:rPr>
-        <w:tab/>
         <w:t xml:space="preserve">Q: How many complaints were not about missed trash pickups?</w:t>
       </w:r>
     </w:p>
@@ -452,17 +450,6 @@
           <w:szCs w:val="24"/>
         </w:rPr>
       </w:pPr>
-      <w:r>
-        <w:rPr>
-          <w:rFonts w:ascii="Times New Roman" w:cs="Times New Roman" w:eastAsia="Times New Roman" w:hAnsi="Times New Roman"/>
-          <w:b w:val="1"/>
-          <w:bCs w:val="1"/>
-          <w:sz w:val="24"/>
-          <w:szCs w:val="24"/>
-          <w:rtl w:val="0"/>
-        </w:rPr>
-        <w:tab/>
-      </w:r>
       <w:r>
         <w:rPr>
           <w:rFonts w:ascii="Times New Roman" w:cs="Times New Roman" w:eastAsia="Times New Roman" w:hAnsi="Times New Roman"/>
@@ -3109,6 +3096,232 @@
       <w:pPr>
         <w:rPr>
           <w:rFonts w:ascii="Times New Roman" w:cs="Times New Roman" w:eastAsia="Times New Roman" w:hAnsi="Times New Roman"/>
+          <w:b w:val="1"/>
+          <w:bCs w:val="1"/>
+          <w:sz w:val="24"/>
+          <w:szCs w:val="24"/>
+        </w:rPr>
+      </w:pPr>
+      <w:r>
+        <w:rPr>
+          <w:rFonts w:ascii="Times New Roman" w:cs="Times New Roman" w:eastAsia="Times New Roman" w:hAnsi="Times New Roman"/>
+          <w:b w:val="1"/>
+          <w:bCs w:val="1"/>
+          <w:sz w:val="24"/>
+          <w:szCs w:val="24"/>
+          <w:rtl w:val="0"/>
+        </w:rPr>
+        <w:t xml:space="preserve">At this point, I started a new chat with Claude, so all previous </w:t>
+      </w:r>
+      <w:r>
+        <w:rPr>
+          <w:rFonts w:ascii="Times New Roman" w:cs="Times New Roman" w:eastAsia="Times New Roman" w:hAnsi="Times New Roman"/>
+          <w:b w:val="1"/>
+          <w:bCs w:val="1"/>
+          <w:sz w:val="24"/>
+          <w:szCs w:val="24"/>
+          <w:rtl w:val="0"/>
+        </w:rPr>
+        <w:t xml:space="preserve">memory</w:t>
+      </w:r>
+      <w:r>
+        <w:rPr>
+          <w:rFonts w:ascii="Times New Roman" w:cs="Times New Roman" w:eastAsia="Times New Roman" w:hAnsi="Times New Roman"/>
+          <w:b w:val="1"/>
+          <w:bCs w:val="1"/>
+          <w:sz w:val="24"/>
+          <w:szCs w:val="24"/>
+          <w:rtl w:val="0"/>
+        </w:rPr>
+        <w:t xml:space="preserve"> </w:t>
+      </w:r>
+      <w:r>
+        <w:rPr>
+          <w:rFonts w:ascii="Times New Roman" w:cs="Times New Roman" w:eastAsia="Times New Roman" w:hAnsi="Times New Roman"/>
+          <w:b w:val="1"/>
+          <w:bCs w:val="1"/>
+          <w:sz w:val="24"/>
+          <w:szCs w:val="24"/>
+          <w:rtl w:val="0"/>
+        </w:rPr>
+        <w:t xml:space="preserve">has</w:t>
+      </w:r>
+      <w:r>
+        <w:rPr>
+          <w:rFonts w:ascii="Times New Roman" w:cs="Times New Roman" w:eastAsia="Times New Roman" w:hAnsi="Times New Roman"/>
+          <w:b w:val="1"/>
+          <w:bCs w:val="1"/>
+          <w:sz w:val="24"/>
+          <w:szCs w:val="24"/>
+          <w:rtl w:val="0"/>
+        </w:rPr>
+        <w:t xml:space="preserve"> been erased.</w:t>
+      </w:r>
+    </w:p>
+    <w:p>
+      <w:pPr>
+        <w:rPr>
+          <w:rFonts w:ascii="Times New Roman" w:cs="Times New Roman" w:eastAsia="Times New Roman" w:hAnsi="Times New Roman"/>
+          <w:b w:val="1"/>
+          <w:bCs w:val="1"/>
+          <w:sz w:val="24"/>
+          <w:szCs w:val="24"/>
+        </w:rPr>
+      </w:pPr>
+      <w:r>
+        <w:rPr>
+          <w:rtl w:val="0"/>
+        </w:rPr>
+      </w:r>
+    </w:p>
+    <w:p>
+      <w:pPr>
+        <w:rPr>
+          <w:rFonts w:ascii="Times New Roman" w:cs="Times New Roman" w:eastAsia="Times New Roman" w:hAnsi="Times New Roman"/>
+          <w:b w:val="1"/>
+          <w:bCs w:val="1"/>
+          <w:sz w:val="24"/>
+          <w:szCs w:val="24"/>
+        </w:rPr>
+      </w:pPr>
+      <w:r>
+        <w:rPr>
+          <w:rFonts w:ascii="Times New Roman" w:cs="Times New Roman" w:eastAsia="Times New Roman" w:hAnsi="Times New Roman"/>
+          <w:b w:val="1"/>
+          <w:bCs w:val="1"/>
+          <w:sz w:val="24"/>
+          <w:szCs w:val="24"/>
+          <w:rtl w:val="0"/>
+        </w:rPr>
+        <w:t xml:space="preserve">Q. Give me a new column located between Description and Address named ‘Missed Pickup’ and set the value to either true or false. If the Request column has missed pick up in it, set this value to true. If the Description column describes the act of missing a pickup (includes synonyms for missed) then this value is also true. All other combinations of Requests and Descriptions get a value of False. </w:t>
+      </w:r>
+    </w:p>
+    <w:p>
+      <w:pPr>
+        <w:rPr>
+          <w:rFonts w:ascii="Times New Roman" w:cs="Times New Roman" w:eastAsia="Times New Roman" w:hAnsi="Times New Roman"/>
+          <w:b w:val="1"/>
+          <w:bCs w:val="1"/>
+          <w:sz w:val="24"/>
+          <w:szCs w:val="24"/>
+        </w:rPr>
+      </w:pPr>
+      <w:r>
+        <w:rPr>
+          <w:rtl w:val="0"/>
+        </w:rPr>
+      </w:r>
+    </w:p>
+    <w:p>
+      <w:pPr>
+        <w:rPr>
+          <w:rFonts w:ascii="Times New Roman" w:cs="Times New Roman" w:eastAsia="Times New Roman" w:hAnsi="Times New Roman"/>
+          <w:sz w:val="24"/>
+          <w:szCs w:val="24"/>
+        </w:rPr>
+      </w:pPr>
+      <w:r>
+        <w:rPr>
+          <w:rFonts w:ascii="Times New Roman" w:cs="Times New Roman" w:eastAsia="Times New Roman" w:hAnsi="Times New Roman"/>
+          <w:sz w:val="24"/>
+          <w:szCs w:val="24"/>
+          <w:rtl w:val="0"/>
+        </w:rPr>
+        <w:t xml:space="preserve">A. I'll take a look at the columns first to find Description, Address, and Request. Columns: C=Request, D=Description, E=Incident Address. I'll insert a new column at E, name it "Missed Pickup", and fill the formula down through row 20227. Now write the header and formula. The formula checks Request for "missed pickup" or Description for missed-pickup synonyms (missed, miss, skipped, skip, passed, passed over, didn't pick up, did not pick up, did not pick up, no pickup, not picked up, never picked up, forgot). The formula in </w:t>
+      </w:r>
+    </w:p>
+    <w:p>
+      <w:pPr>
+        <w:rPr>
+          <w:rFonts w:ascii="Times New Roman" w:cs="Times New Roman" w:eastAsia="Times New Roman" w:hAnsi="Times New Roman"/>
+          <w:sz w:val="24"/>
+          <w:szCs w:val="24"/>
+        </w:rPr>
+      </w:pPr>
+      <w:r>
+        <w:rPr>
+          <w:rFonts w:ascii="Times New Roman" w:cs="Times New Roman" w:eastAsia="Times New Roman" w:hAnsi="Times New Roman"/>
+          <w:sz w:val="24"/>
+          <w:szCs w:val="24"/>
+          <w:rtl w:val="0"/>
+        </w:rPr>
+        <w:t xml:space="preserve">Trash_hauler_report_with_lat_ln E2</w:t>
+      </w:r>
+    </w:p>
+    <w:p>
+      <w:pPr>
+        <w:rPr>
+          <w:rFonts w:ascii="Times New Roman" w:cs="Times New Roman" w:eastAsia="Times New Roman" w:hAnsi="Times New Roman"/>
+          <w:sz w:val="24"/>
+          <w:szCs w:val="24"/>
+        </w:rPr>
+      </w:pPr>
+      <w:r>
+        <w:rPr>
+          <w:rFonts w:ascii="Times New Roman" w:cs="Times New Roman" w:eastAsia="Times New Roman" w:hAnsi="Times New Roman"/>
+          <w:sz w:val="24"/>
+          <w:szCs w:val="24"/>
+          <w:rtl w:val="0"/>
+        </w:rPr>
+        <w:t xml:space="preserve"> returns TRUE if:</w:t>
+      </w:r>
+    </w:p>
+    <w:p>
+      <w:pPr>
+        <w:rPr>
+          <w:rFonts w:ascii="Times New Roman" w:cs="Times New Roman" w:eastAsia="Times New Roman" w:hAnsi="Times New Roman"/>
+          <w:sz w:val="24"/>
+          <w:szCs w:val="24"/>
+        </w:rPr>
+      </w:pPr>
+      <w:r>
+        <w:rPr>
+          <w:rFonts w:ascii="Times New Roman" w:cs="Times New Roman" w:eastAsia="Times New Roman" w:hAnsi="Times New Roman"/>
+          <w:sz w:val="24"/>
+          <w:szCs w:val="24"/>
+          <w:rtl w:val="0"/>
+        </w:rPr>
+        <w:t xml:space="preserve">Request contains "missed pickup", OR</w:t>
+      </w:r>
+    </w:p>
+    <w:p>
+      <w:pPr>
+        <w:rPr>
+          <w:rFonts w:ascii="Times New Roman" w:cs="Times New Roman" w:eastAsia="Times New Roman" w:hAnsi="Times New Roman"/>
+          <w:sz w:val="24"/>
+          <w:szCs w:val="24"/>
+        </w:rPr>
+      </w:pPr>
+      <w:r>
+        <w:rPr>
+          <w:rFonts w:ascii="Times New Roman" w:cs="Times New Roman" w:eastAsia="Times New Roman" w:hAnsi="Times New Roman"/>
+          <w:sz w:val="24"/>
+          <w:szCs w:val="24"/>
+          <w:rtl w:val="0"/>
+        </w:rPr>
+        <w:t xml:space="preserve">Description contains any of: missed, miss (as a word), skipped, skip (as a word), passed over, passed up, didn't pick, did not pick, did not pick, not picked up, never picked, no pickup, no pick up, forgot, left behind, overlooked, bypassed</w:t>
+      </w:r>
+    </w:p>
+    <w:p>
+      <w:pPr>
+        <w:rPr>
+          <w:rFonts w:ascii="Times New Roman" w:cs="Times New Roman" w:eastAsia="Times New Roman" w:hAnsi="Times New Roman"/>
+          <w:i w:val="1"/>
+          <w:iCs w:val="1"/>
+          <w:sz w:val="24"/>
+          <w:szCs w:val="24"/>
+        </w:rPr>
+      </w:pPr>
+      <w:r>
+        <w:rPr>
+          <w:rtl w:val="0"/>
+        </w:rPr>
+      </w:r>
+    </w:p>
+    <w:p>
+      <w:pPr>
+        <w:rPr>
+          <w:rFonts w:ascii="Times New Roman" w:cs="Times New Roman" w:eastAsia="Times New Roman" w:hAnsi="Times New Roman"/>
           <w:i w:val="1"/>
           <w:iCs w:val="1"/>
           <w:sz w:val="24"/>
@@ -3141,6 +3354,114 @@
         <w:rPr>
           <w:rtl w:val="0"/>
         </w:rPr>
+      </w:r>
+    </w:p>
+    <w:p>
+      <w:pPr>
+        <w:rPr>
+          <w:rFonts w:ascii="Times New Roman" w:cs="Times New Roman" w:eastAsia="Times New Roman" w:hAnsi="Times New Roman"/>
+          <w:b w:val="1"/>
+          <w:bCs w:val="1"/>
+          <w:sz w:val="24"/>
+          <w:szCs w:val="24"/>
+        </w:rPr>
+      </w:pPr>
+      <w:r>
+        <w:rPr>
+          <w:rFonts w:ascii="Times New Roman" w:cs="Times New Roman" w:eastAsia="Times New Roman" w:hAnsi="Times New Roman"/>
+          <w:b w:val="1"/>
+          <w:bCs w:val="1"/>
+          <w:sz w:val="24"/>
+          <w:szCs w:val="24"/>
+          <w:rtl w:val="0"/>
+        </w:rPr>
+        <w:t xml:space="preserve">Q. Give me a % of missed pickups using the true false answers in the new Missed Pickup column. </w:t>
+      </w:r>
+    </w:p>
+    <w:p>
+      <w:pPr>
+        <w:rPr>
+          <w:rFonts w:ascii="Times New Roman" w:cs="Times New Roman" w:eastAsia="Times New Roman" w:hAnsi="Times New Roman"/>
+          <w:b w:val="1"/>
+          <w:bCs w:val="1"/>
+          <w:sz w:val="24"/>
+          <w:szCs w:val="24"/>
+        </w:rPr>
+      </w:pPr>
+      <w:r>
+        <w:rPr>
+          <w:rtl w:val="0"/>
+        </w:rPr>
+      </w:r>
+    </w:p>
+    <w:p>
+      <w:pPr>
+        <w:rPr>
+          <w:rFonts w:ascii="Times New Roman" w:cs="Times New Roman" w:eastAsia="Times New Roman" w:hAnsi="Times New Roman"/>
+          <w:b w:val="1"/>
+          <w:bCs w:val="1"/>
+          <w:sz w:val="24"/>
+          <w:szCs w:val="24"/>
+        </w:rPr>
+      </w:pPr>
+      <w:r>
+        <w:rPr>
+          <w:rtl w:val="0"/>
+        </w:rPr>
+      </w:r>
+    </w:p>
+    <w:p>
+      <w:pPr>
+        <w:rPr>
+          <w:rFonts w:ascii="Times New Roman" w:cs="Times New Roman" w:eastAsia="Times New Roman" w:hAnsi="Times New Roman"/>
+          <w:sz w:val="24"/>
+          <w:szCs w:val="24"/>
+        </w:rPr>
+      </w:pPr>
+      <w:r>
+        <w:rPr>
+          <w:rFonts w:ascii="Times New Roman" w:cs="Times New Roman" w:eastAsia="Times New Roman" w:hAnsi="Times New Roman"/>
+          <w:sz w:val="24"/>
+          <w:szCs w:val="24"/>
+          <w:rtl w:val="0"/>
+        </w:rPr>
+        <w:t xml:space="preserve">A. 88.19% of rows are flagged as missed pickups</w:t>
+      </w:r>
+    </w:p>
+    <w:p>
+      <w:pPr>
+        <w:rPr>
+          <w:rFonts w:ascii="Times New Roman" w:cs="Times New Roman" w:eastAsia="Times New Roman" w:hAnsi="Times New Roman"/>
+          <w:sz w:val="24"/>
+          <w:szCs w:val="24"/>
+        </w:rPr>
+      </w:pPr>
+      <w:r>
+        <w:rPr>
+          <w:rtl w:val="0"/>
+        </w:rPr>
+      </w:r>
+    </w:p>
+    <w:p>
+      <w:pPr>
+        <w:rPr>
+          <w:rFonts w:ascii="Times New Roman" w:cs="Times New Roman" w:eastAsia="Times New Roman" w:hAnsi="Times New Roman"/>
+          <w:b w:val="1"/>
+          <w:bCs w:val="1"/>
+          <w:sz w:val="24"/>
+          <w:szCs w:val="24"/>
+        </w:rPr>
+      </w:pPr>
+      <w:r>
+        <w:rPr>
+          <w:rFonts w:ascii="Times New Roman" w:cs="Times New Roman" w:eastAsia="Times New Roman" w:hAnsi="Times New Roman"/>
+          <w:b w:val="1"/>
+          <w:bCs w:val="1"/>
+          <w:sz w:val="24"/>
+          <w:szCs w:val="24"/>
+          <w:rtl w:val="0"/>
+        </w:rPr>
+        <w:t xml:space="preserve">There is a 1% difference in the answer given this second time around with 88.19% now being the amount of missed pickups where before it was 89.14% that was missed pickups. </w:t>
       </w:r>
     </w:p>
     <w:p>
@@ -3241,6 +3562,78 @@
       <w:pPr>
         <w:rPr>
           <w:rFonts w:ascii="Times New Roman" w:cs="Times New Roman" w:eastAsia="Times New Roman" w:hAnsi="Times New Roman"/>
+          <w:b w:val="1"/>
+          <w:bCs w:val="1"/>
+          <w:sz w:val="24"/>
+          <w:szCs w:val="24"/>
+        </w:rPr>
+      </w:pPr>
+      <w:r>
+        <w:rPr>
+          <w:rFonts w:ascii="Times New Roman" w:cs="Times New Roman" w:eastAsia="Times New Roman" w:hAnsi="Times New Roman"/>
+          <w:b w:val="1"/>
+          <w:bCs w:val="1"/>
+          <w:sz w:val="24"/>
+          <w:szCs w:val="24"/>
+          <w:rtl w:val="0"/>
+        </w:rPr>
+        <w:t xml:space="preserve">Q. Which Council District has the greatest number of true values? How many are there and what percent does it make up of that District's total complaints?</w:t>
+      </w:r>
+    </w:p>
+    <w:p>
+      <w:pPr>
+        <w:rPr>
+          <w:rFonts w:ascii="Times New Roman" w:cs="Times New Roman" w:eastAsia="Times New Roman" w:hAnsi="Times New Roman"/>
+          <w:b w:val="1"/>
+          <w:bCs w:val="1"/>
+          <w:sz w:val="24"/>
+          <w:szCs w:val="24"/>
+        </w:rPr>
+      </w:pPr>
+      <w:r>
+        <w:rPr>
+          <w:rtl w:val="0"/>
+        </w:rPr>
+      </w:r>
+    </w:p>
+    <w:p>
+      <w:pPr>
+        <w:rPr>
+          <w:rFonts w:ascii="Times New Roman" w:cs="Times New Roman" w:eastAsia="Times New Roman" w:hAnsi="Times New Roman"/>
+          <w:sz w:val="24"/>
+          <w:szCs w:val="24"/>
+        </w:rPr>
+      </w:pPr>
+      <w:r>
+        <w:rPr>
+          <w:rFonts w:ascii="Times New Roman" w:cs="Times New Roman" w:eastAsia="Times New Roman" w:hAnsi="Times New Roman"/>
+          <w:sz w:val="24"/>
+          <w:szCs w:val="24"/>
+          <w:rtl w:val="0"/>
+        </w:rPr>
+        <w:t xml:space="preserve">A. Council District 25 has the most: 1,142 missed pickups out of 1,236 total complaints in that district = 92.39%. </w:t>
+      </w:r>
+    </w:p>
+    <w:p>
+      <w:pPr>
+        <w:rPr>
+          <w:rFonts w:ascii="Times New Roman" w:cs="Times New Roman" w:eastAsia="Times New Roman" w:hAnsi="Times New Roman"/>
+          <w:i w:val="1"/>
+          <w:iCs w:val="1"/>
+          <w:sz w:val="24"/>
+          <w:szCs w:val="24"/>
+        </w:rPr>
+      </w:pPr>
+      <w:r>
+        <w:rPr>
+          <w:rtl w:val="0"/>
+        </w:rPr>
+      </w:r>
+    </w:p>
+    <w:p>
+      <w:pPr>
+        <w:rPr>
+          <w:rFonts w:ascii="Times New Roman" w:cs="Times New Roman" w:eastAsia="Times New Roman" w:hAnsi="Times New Roman"/>
           <w:i w:val="1"/>
           <w:iCs w:val="1"/>
           <w:sz w:val="24"/>
@@ -3279,6 +3672,78 @@
       <w:pPr>
         <w:rPr>
           <w:rFonts w:ascii="Times New Roman" w:cs="Times New Roman" w:eastAsia="Times New Roman" w:hAnsi="Times New Roman"/>
+          <w:b w:val="1"/>
+          <w:bCs w:val="1"/>
+          <w:sz w:val="24"/>
+          <w:szCs w:val="24"/>
+        </w:rPr>
+      </w:pPr>
+      <w:r>
+        <w:rPr>
+          <w:rFonts w:ascii="Times New Roman" w:cs="Times New Roman" w:eastAsia="Times New Roman" w:hAnsi="Times New Roman"/>
+          <w:b w:val="1"/>
+          <w:bCs w:val="1"/>
+          <w:sz w:val="24"/>
+          <w:szCs w:val="24"/>
+          <w:rtl w:val="0"/>
+        </w:rPr>
+        <w:t xml:space="preserve">Q. Which Council District has the highest percent of True values? How many missed complaints were there in that District?</w:t>
+      </w:r>
+    </w:p>
+    <w:p>
+      <w:pPr>
+        <w:rPr>
+          <w:rFonts w:ascii="Times New Roman" w:cs="Times New Roman" w:eastAsia="Times New Roman" w:hAnsi="Times New Roman"/>
+          <w:b w:val="1"/>
+          <w:bCs w:val="1"/>
+          <w:sz w:val="24"/>
+          <w:szCs w:val="24"/>
+        </w:rPr>
+      </w:pPr>
+      <w:r>
+        <w:rPr>
+          <w:rtl w:val="0"/>
+        </w:rPr>
+      </w:r>
+    </w:p>
+    <w:p>
+      <w:pPr>
+        <w:rPr>
+          <w:rFonts w:ascii="Times New Roman" w:cs="Times New Roman" w:eastAsia="Times New Roman" w:hAnsi="Times New Roman"/>
+          <w:sz w:val="24"/>
+          <w:szCs w:val="24"/>
+        </w:rPr>
+      </w:pPr>
+      <w:r>
+        <w:rPr>
+          <w:rFonts w:ascii="Times New Roman" w:cs="Times New Roman" w:eastAsia="Times New Roman" w:hAnsi="Times New Roman"/>
+          <w:sz w:val="24"/>
+          <w:szCs w:val="24"/>
+          <w:rtl w:val="0"/>
+        </w:rPr>
+        <w:t xml:space="preserve">A. Districts 10 and 35 hit 100%, but with only 2 and 3 complaints they're not meaningful. Among districts with real volume, District 31 is highest at 95.10% — 408 missed pickups out of 429 total complaints</w:t>
+      </w:r>
+    </w:p>
+    <w:p>
+      <w:pPr>
+        <w:rPr>
+          <w:rFonts w:ascii="Times New Roman" w:cs="Times New Roman" w:eastAsia="Times New Roman" w:hAnsi="Times New Roman"/>
+          <w:i w:val="1"/>
+          <w:iCs w:val="1"/>
+          <w:sz w:val="24"/>
+          <w:szCs w:val="24"/>
+        </w:rPr>
+      </w:pPr>
+      <w:r>
+        <w:rPr>
+          <w:rtl w:val="0"/>
+        </w:rPr>
+      </w:r>
+    </w:p>
+    <w:p>
+      <w:pPr>
+        <w:rPr>
+          <w:rFonts w:ascii="Times New Roman" w:cs="Times New Roman" w:eastAsia="Times New Roman" w:hAnsi="Times New Roman"/>
           <w:i w:val="1"/>
           <w:iCs w:val="1"/>
           <w:sz w:val="24"/>
@@ -3339,6 +3804,176 @@
       <w:pPr>
         <w:rPr>
           <w:rFonts w:ascii="Times New Roman" w:cs="Times New Roman" w:eastAsia="Times New Roman" w:hAnsi="Times New Roman"/>
+          <w:b w:val="1"/>
+          <w:bCs w:val="1"/>
+          <w:sz w:val="24"/>
+          <w:szCs w:val="24"/>
+        </w:rPr>
+      </w:pPr>
+      <w:r>
+        <w:rPr>
+          <w:rFonts w:ascii="Times New Roman" w:cs="Times New Roman" w:eastAsia="Times New Roman" w:hAnsi="Times New Roman"/>
+          <w:b w:val="1"/>
+          <w:bCs w:val="1"/>
+          <w:sz w:val="24"/>
+          <w:szCs w:val="24"/>
+          <w:rtl w:val="0"/>
+        </w:rPr>
+        <w:t xml:space="preserve">Q. How many of the Council Districts have 100% True and which ones are they? How many Council Districts have 100% False and which ones are they?</w:t>
+      </w:r>
+    </w:p>
+    <w:p>
+      <w:pPr>
+        <w:rPr>
+          <w:rFonts w:ascii="Times New Roman" w:cs="Times New Roman" w:eastAsia="Times New Roman" w:hAnsi="Times New Roman"/>
+          <w:b w:val="1"/>
+          <w:bCs w:val="1"/>
+          <w:sz w:val="24"/>
+          <w:szCs w:val="24"/>
+        </w:rPr>
+      </w:pPr>
+      <w:r>
+        <w:rPr>
+          <w:rtl w:val="0"/>
+        </w:rPr>
+      </w:r>
+    </w:p>
+    <w:p>
+      <w:pPr>
+        <w:rPr>
+          <w:rFonts w:ascii="Times New Roman" w:cs="Times New Roman" w:eastAsia="Times New Roman" w:hAnsi="Times New Roman"/>
+          <w:sz w:val="24"/>
+          <w:szCs w:val="24"/>
+        </w:rPr>
+      </w:pPr>
+      <w:r>
+        <w:rPr>
+          <w:rFonts w:ascii="Times New Roman" w:cs="Times New Roman" w:eastAsia="Times New Roman" w:hAnsi="Times New Roman"/>
+          <w:sz w:val="24"/>
+          <w:szCs w:val="24"/>
+          <w:rtl w:val="0"/>
+        </w:rPr>
+        <w:t xml:space="preserve">A. 100% True (missed): 2 districts</w:t>
+      </w:r>
+    </w:p>
+    <w:p>
+      <w:pPr>
+        <w:rPr>
+          <w:rFonts w:ascii="Times New Roman" w:cs="Times New Roman" w:eastAsia="Times New Roman" w:hAnsi="Times New Roman"/>
+          <w:sz w:val="24"/>
+          <w:szCs w:val="24"/>
+        </w:rPr>
+      </w:pPr>
+      <w:r>
+        <w:rPr>
+          <w:rtl w:val="0"/>
+        </w:rPr>
+      </w:r>
+    </w:p>
+    <w:p>
+      <w:pPr>
+        <w:rPr>
+          <w:rFonts w:ascii="Times New Roman" w:cs="Times New Roman" w:eastAsia="Times New Roman" w:hAnsi="Times New Roman"/>
+          <w:sz w:val="24"/>
+          <w:szCs w:val="24"/>
+        </w:rPr>
+      </w:pPr>
+      <w:r>
+        <w:rPr>
+          <w:rFonts w:ascii="Times New Roman" w:cs="Times New Roman" w:eastAsia="Times New Roman" w:hAnsi="Times New Roman"/>
+          <w:sz w:val="24"/>
+          <w:szCs w:val="24"/>
+          <w:rtl w:val="0"/>
+        </w:rPr>
+        <w:t xml:space="preserve">District 10 — 2 complaints, all missed</w:t>
+      </w:r>
+    </w:p>
+    <w:p>
+      <w:pPr>
+        <w:rPr>
+          <w:rFonts w:ascii="Times New Roman" w:cs="Times New Roman" w:eastAsia="Times New Roman" w:hAnsi="Times New Roman"/>
+          <w:sz w:val="24"/>
+          <w:szCs w:val="24"/>
+        </w:rPr>
+      </w:pPr>
+      <w:r>
+        <w:rPr>
+          <w:rFonts w:ascii="Times New Roman" w:cs="Times New Roman" w:eastAsia="Times New Roman" w:hAnsi="Times New Roman"/>
+          <w:sz w:val="24"/>
+          <w:szCs w:val="24"/>
+          <w:rtl w:val="0"/>
+        </w:rPr>
+        <w:t xml:space="preserve">District 35 — 3 complaints, all missed</w:t>
+      </w:r>
+    </w:p>
+    <w:p>
+      <w:pPr>
+        <w:rPr>
+          <w:rFonts w:ascii="Times New Roman" w:cs="Times New Roman" w:eastAsia="Times New Roman" w:hAnsi="Times New Roman"/>
+          <w:sz w:val="24"/>
+          <w:szCs w:val="24"/>
+        </w:rPr>
+      </w:pPr>
+      <w:r>
+        <w:rPr>
+          <w:rFonts w:ascii="Times New Roman" w:cs="Times New Roman" w:eastAsia="Times New Roman" w:hAnsi="Times New Roman"/>
+          <w:sz w:val="24"/>
+          <w:szCs w:val="24"/>
+          <w:rtl w:val="0"/>
+        </w:rPr>
+        <w:t xml:space="preserve">Let me check for 100% False districts.</w:t>
+      </w:r>
+    </w:p>
+    <w:p>
+      <w:pPr>
+        <w:rPr>
+          <w:rFonts w:ascii="Times New Roman" w:cs="Times New Roman" w:eastAsia="Times New Roman" w:hAnsi="Times New Roman"/>
+          <w:sz w:val="24"/>
+          <w:szCs w:val="24"/>
+        </w:rPr>
+      </w:pPr>
+      <w:r>
+        <w:rPr>
+          <w:rFonts w:ascii="Times New Roman" w:cs="Times New Roman" w:eastAsia="Times New Roman" w:hAnsi="Times New Roman"/>
+          <w:sz w:val="24"/>
+          <w:szCs w:val="24"/>
+          <w:rtl w:val="0"/>
+        </w:rPr>
+        <w:t xml:space="preserve">100% False: none — every district has at least one missed-pickup complaint.</w:t>
+      </w:r>
+    </w:p>
+    <w:p>
+      <w:pPr>
+        <w:rPr>
+          <w:rFonts w:ascii="Times New Roman" w:cs="Times New Roman" w:eastAsia="Times New Roman" w:hAnsi="Times New Roman"/>
+          <w:sz w:val="24"/>
+          <w:szCs w:val="24"/>
+        </w:rPr>
+      </w:pPr>
+      <w:r>
+        <w:rPr>
+          <w:rtl w:val="0"/>
+        </w:rPr>
+      </w:r>
+    </w:p>
+    <w:p>
+      <w:pPr>
+        <w:rPr>
+          <w:rFonts w:ascii="Times New Roman" w:cs="Times New Roman" w:eastAsia="Times New Roman" w:hAnsi="Times New Roman"/>
+          <w:sz w:val="24"/>
+          <w:szCs w:val="24"/>
+        </w:rPr>
+      </w:pPr>
+      <w:r>
+        <w:rPr>
+          <w:rtl w:val="0"/>
+        </w:rPr>
+      </w:r>
+    </w:p>
+    <w:p>
+      <w:pPr>
+        <w:rPr>
+          <w:rFonts w:ascii="Times New Roman" w:cs="Times New Roman" w:eastAsia="Times New Roman" w:hAnsi="Times New Roman"/>
           <w:i w:val="1"/>
           <w:iCs w:val="1"/>
           <w:sz w:val="24"/>
@@ -3377,6 +4012,110 @@
       <w:pPr>
         <w:rPr>
           <w:rFonts w:ascii="Times New Roman" w:cs="Times New Roman" w:eastAsia="Times New Roman" w:hAnsi="Times New Roman"/>
+          <w:b w:val="1"/>
+          <w:bCs w:val="1"/>
+          <w:sz w:val="24"/>
+          <w:szCs w:val="24"/>
+        </w:rPr>
+      </w:pPr>
+      <w:r>
+        <w:rPr>
+          <w:rFonts w:ascii="Times New Roman" w:cs="Times New Roman" w:eastAsia="Times New Roman" w:hAnsi="Times New Roman"/>
+          <w:b w:val="1"/>
+          <w:bCs w:val="1"/>
+          <w:sz w:val="24"/>
+          <w:szCs w:val="24"/>
+          <w:rtl w:val="0"/>
+        </w:rPr>
+        <w:t xml:space="preserve">Q. Using Column H (trash hauler) which trash hauler company had the greatest percent of their complaints due to missed trash pickups, column e being True. What percent is it?</w:t>
+      </w:r>
+    </w:p>
+    <w:p>
+      <w:pPr>
+        <w:rPr>
+          <w:rFonts w:ascii="Times New Roman" w:cs="Times New Roman" w:eastAsia="Times New Roman" w:hAnsi="Times New Roman"/>
+          <w:b w:val="1"/>
+          <w:bCs w:val="1"/>
+          <w:sz w:val="24"/>
+          <w:szCs w:val="24"/>
+        </w:rPr>
+      </w:pPr>
+      <w:r>
+        <w:rPr>
+          <w:rtl w:val="0"/>
+        </w:rPr>
+      </w:r>
+    </w:p>
+    <w:p>
+      <w:pPr>
+        <w:rPr>
+          <w:rFonts w:ascii="Times New Roman" w:cs="Times New Roman" w:eastAsia="Times New Roman" w:hAnsi="Times New Roman"/>
+          <w:sz w:val="24"/>
+          <w:szCs w:val="24"/>
+        </w:rPr>
+      </w:pPr>
+      <w:r>
+        <w:rPr>
+          <w:rFonts w:ascii="Times New Roman" w:cs="Times New Roman" w:eastAsia="Times New Roman" w:hAnsi="Times New Roman"/>
+          <w:sz w:val="24"/>
+          <w:szCs w:val="24"/>
+          <w:rtl w:val="0"/>
+        </w:rPr>
+        <w:t xml:space="preserve">A. RED RIVER has the highest missed-pickup share: 89.54% (12,890 missed out of 14,395 total complaints).</w:t>
+      </w:r>
+    </w:p>
+    <w:p>
+      <w:pPr>
+        <w:rPr>
+          <w:rFonts w:ascii="Times New Roman" w:cs="Times New Roman" w:eastAsia="Times New Roman" w:hAnsi="Times New Roman"/>
+          <w:sz w:val="24"/>
+          <w:szCs w:val="24"/>
+        </w:rPr>
+      </w:pPr>
+      <w:r>
+        <w:rPr>
+          <w:rtl w:val="0"/>
+        </w:rPr>
+      </w:r>
+    </w:p>
+    <w:p>
+      <w:pPr>
+        <w:rPr>
+          <w:rFonts w:ascii="Times New Roman" w:cs="Times New Roman" w:eastAsia="Times New Roman" w:hAnsi="Times New Roman"/>
+          <w:sz w:val="24"/>
+          <w:szCs w:val="24"/>
+        </w:rPr>
+      </w:pPr>
+      <w:r>
+        <w:rPr>
+          <w:rFonts w:ascii="Times New Roman" w:cs="Times New Roman" w:eastAsia="Times New Roman" w:hAnsi="Times New Roman"/>
+          <w:sz w:val="24"/>
+          <w:szCs w:val="24"/>
+          <w:rtl w:val="0"/>
+        </w:rPr>
+        <w:t xml:space="preserve">Note: "METRO" and "Metro" appear as separate entries due to casing. Combined, Metro is 3,051 / 3,580 = 85.22% — still below Red River. Want me to normalize the casing?</w:t>
+      </w:r>
+    </w:p>
+    <w:p>
+      <w:pPr>
+        <w:rPr>
+          <w:rFonts w:ascii="Times New Roman" w:cs="Times New Roman" w:eastAsia="Times New Roman" w:hAnsi="Times New Roman"/>
+          <w:i w:val="1"/>
+          <w:iCs w:val="1"/>
+          <w:sz w:val="24"/>
+          <w:szCs w:val="24"/>
+        </w:rPr>
+      </w:pPr>
+      <w:r>
+        <w:rPr>
+          <w:rtl w:val="0"/>
+        </w:rPr>
+      </w:r>
+    </w:p>
+    <w:p>
+      <w:pPr>
+        <w:rPr>
+          <w:rFonts w:ascii="Times New Roman" w:cs="Times New Roman" w:eastAsia="Times New Roman" w:hAnsi="Times New Roman"/>
           <w:i w:val="1"/>
           <w:iCs w:val="1"/>
           <w:sz w:val="24"/>
@@ -3405,6 +4144,69 @@
           <w:szCs w:val="24"/>
         </w:rPr>
       </w:pPr>
+      <w:r>
+        <w:rPr>
+          <w:rtl w:val="0"/>
+        </w:rPr>
+      </w:r>
+    </w:p>
+    <w:p>
+      <w:pPr>
+        <w:rPr>
+          <w:rFonts w:ascii="Times New Roman" w:cs="Times New Roman" w:eastAsia="Times New Roman" w:hAnsi="Times New Roman"/>
+          <w:b w:val="1"/>
+          <w:bCs w:val="1"/>
+          <w:sz w:val="24"/>
+          <w:szCs w:val="24"/>
+        </w:rPr>
+      </w:pPr>
+      <w:r>
+        <w:rPr>
+          <w:rFonts w:ascii="Times New Roman" w:cs="Times New Roman" w:eastAsia="Times New Roman" w:hAnsi="Times New Roman"/>
+          <w:b w:val="1"/>
+          <w:bCs w:val="1"/>
+          <w:sz w:val="24"/>
+          <w:szCs w:val="24"/>
+          <w:rtl w:val="0"/>
+        </w:rPr>
+        <w:t xml:space="preserve">Q. Which incident Address (column F) has the greatest number of missed pickups? How many are there?</w:t>
+      </w:r>
+    </w:p>
+    <w:p>
+      <w:pPr>
+        <w:rPr>
+          <w:rFonts w:ascii="Times New Roman" w:cs="Times New Roman" w:eastAsia="Times New Roman" w:hAnsi="Times New Roman"/>
+          <w:b w:val="1"/>
+          <w:bCs w:val="1"/>
+          <w:sz w:val="24"/>
+          <w:szCs w:val="24"/>
+        </w:rPr>
+      </w:pPr>
+      <w:r>
+        <w:rPr>
+          <w:rtl w:val="0"/>
+        </w:rPr>
+      </w:r>
+    </w:p>
+    <w:p>
+      <w:pPr>
+        <w:rPr>
+          <w:rFonts w:ascii="Times New Roman" w:cs="Times New Roman" w:eastAsia="Times New Roman" w:hAnsi="Times New Roman"/>
+          <w:i w:val="1"/>
+          <w:iCs w:val="1"/>
+          <w:sz w:val="24"/>
+          <w:szCs w:val="24"/>
+        </w:rPr>
+      </w:pPr>
+      <w:r>
+        <w:rPr>
+          <w:rFonts w:ascii="Times New Roman" w:cs="Times New Roman" w:eastAsia="Times New Roman" w:hAnsi="Times New Roman"/>
+          <w:sz w:val="24"/>
+          <w:szCs w:val="24"/>
+          <w:rtl w:val="0"/>
+        </w:rPr>
+        <w:t xml:space="preserve">A. 5135 Hickory Hollow Pkwy — 21 missed pickups.</w:t>
+      </w:r>
       <w:r>
         <w:rPr>
           <w:rtl w:val="0"/>
@@ -3585,6 +4387,259 @@
       <w:pPr>
         <w:rPr>
           <w:rFonts w:ascii="Times New Roman" w:cs="Times New Roman" w:eastAsia="Times New Roman" w:hAnsi="Times New Roman"/>
+          <w:b w:val="1"/>
+          <w:bCs w:val="1"/>
+          <w:sz w:val="24"/>
+          <w:szCs w:val="24"/>
+        </w:rPr>
+      </w:pPr>
+      <w:r>
+        <w:rPr>
+          <w:rFonts w:ascii="Times New Roman" w:cs="Times New Roman" w:eastAsia="Times New Roman" w:hAnsi="Times New Roman"/>
+          <w:b w:val="1"/>
+          <w:bCs w:val="1"/>
+          <w:sz w:val="24"/>
+          <w:szCs w:val="24"/>
+          <w:rtl w:val="0"/>
+        </w:rPr>
+        <w:t xml:space="preserve">Q. I want you to calculate fines given to each trash hauler for missed pickups. The fine is $500. Every Incident Address (Column F) that has at least two Trues in Column E (missed Pickup) gives a $500 dollar fine to one of the trash hauler companies (Column H). For every added True, another $500 dollars is added to that trash hauler’s bill amount. So, if there are 3 Trues, the fine is $1000, if there are 4, $1500, if there are 5, $2000 and so on. Take these results and create a new sheet called ‘Total Fine Amount’ That contains each trash hauler and the final total bill amount they owe. Include a column with how many missed pick ups they have and another column of what percent of the Requests is that company responsible for.</w:t>
+      </w:r>
+    </w:p>
+    <w:p>
+      <w:pPr>
+        <w:rPr>
+          <w:rFonts w:ascii="Times New Roman" w:cs="Times New Roman" w:eastAsia="Times New Roman" w:hAnsi="Times New Roman"/>
+          <w:b w:val="1"/>
+          <w:bCs w:val="1"/>
+          <w:sz w:val="24"/>
+          <w:szCs w:val="24"/>
+        </w:rPr>
+      </w:pPr>
+      <w:r>
+        <w:rPr>
+          <w:rtl w:val="0"/>
+        </w:rPr>
+      </w:r>
+    </w:p>
+    <w:p>
+      <w:pPr>
+        <w:rPr>
+          <w:rFonts w:ascii="Times New Roman" w:cs="Times New Roman" w:eastAsia="Times New Roman" w:hAnsi="Times New Roman"/>
+          <w:b w:val="1"/>
+          <w:bCs w:val="1"/>
+          <w:sz w:val="24"/>
+          <w:szCs w:val="24"/>
+        </w:rPr>
+      </w:pPr>
+      <w:r>
+        <w:rPr>
+          <w:rtl w:val="0"/>
+        </w:rPr>
+      </w:r>
+    </w:p>
+    <w:p>
+      <w:pPr>
+        <w:rPr>
+          <w:rFonts w:ascii="Times New Roman" w:cs="Times New Roman" w:eastAsia="Times New Roman" w:hAnsi="Times New Roman"/>
+          <w:sz w:val="24"/>
+          <w:szCs w:val="24"/>
+        </w:rPr>
+      </w:pPr>
+      <w:r>
+        <w:rPr>
+          <w:rFonts w:ascii="Times New Roman" w:cs="Times New Roman" w:eastAsia="Times New Roman" w:hAnsi="Times New Roman"/>
+          <w:sz w:val="24"/>
+          <w:szCs w:val="24"/>
+          <w:rtl w:val="0"/>
+        </w:rPr>
+        <w:t xml:space="preserve">A. Hauler</w:t>
+        <w:tab/>
+        <w:tab/>
+        <w:tab/>
+        <w:t xml:space="preserve">Missed</w:t>
+        <w:tab/>
+        <w:tab/>
+        <w:tab/>
+        <w:t xml:space="preserve">% of Requests</w:t>
+        <w:tab/>
+        <w:tab/>
+        <w:tab/>
+        <w:t xml:space="preserve">Fine</w:t>
+      </w:r>
+    </w:p>
+    <w:p>
+      <w:pPr>
+        <w:rPr>
+          <w:rFonts w:ascii="Times New Roman" w:cs="Times New Roman" w:eastAsia="Times New Roman" w:hAnsi="Times New Roman"/>
+          <w:sz w:val="24"/>
+          <w:szCs w:val="24"/>
+        </w:rPr>
+      </w:pPr>
+      <w:r>
+        <w:rPr>
+          <w:rFonts w:ascii="Times New Roman" w:cs="Times New Roman" w:eastAsia="Times New Roman" w:hAnsi="Times New Roman"/>
+          <w:sz w:val="24"/>
+          <w:szCs w:val="24"/>
+          <w:rtl w:val="0"/>
+        </w:rPr>
+        <w:t xml:space="preserve">RED RIVER</w:t>
+        <w:tab/>
+        <w:tab/>
+        <w:tab/>
+        <w:t xml:space="preserve">12,890</w:t>
+        <w:tab/>
+        <w:tab/>
+        <w:tab/>
+        <w:t xml:space="preserve">74.49%</w:t>
+        <w:tab/>
+        <w:tab/>
+        <w:tab/>
+        <w:t xml:space="preserve">$1,903,000</w:t>
+      </w:r>
+    </w:p>
+    <w:p>
+      <w:pPr>
+        <w:rPr>
+          <w:rFonts w:ascii="Times New Roman" w:cs="Times New Roman" w:eastAsia="Times New Roman" w:hAnsi="Times New Roman"/>
+          <w:sz w:val="24"/>
+          <w:szCs w:val="24"/>
+        </w:rPr>
+      </w:pPr>
+      <w:r>
+        <w:rPr>
+          <w:rFonts w:ascii="Times New Roman" w:cs="Times New Roman" w:eastAsia="Times New Roman" w:hAnsi="Times New Roman"/>
+          <w:sz w:val="24"/>
+          <w:szCs w:val="24"/>
+          <w:rtl w:val="0"/>
+        </w:rPr>
+        <w:t xml:space="preserve">METRO (combined)</w:t>
+        <w:tab/>
+        <w:tab/>
+        <w:t xml:space="preserve">3,051</w:t>
+        <w:tab/>
+        <w:tab/>
+        <w:tab/>
+        <w:t xml:space="preserve">18.53%</w:t>
+        <w:tab/>
+        <w:tab/>
+        <w:tab/>
+        <w:t xml:space="preserve">$439,500</w:t>
+      </w:r>
+    </w:p>
+    <w:p>
+      <w:pPr>
+        <w:rPr>
+          <w:rFonts w:ascii="Times New Roman" w:cs="Times New Roman" w:eastAsia="Times New Roman" w:hAnsi="Times New Roman"/>
+          <w:sz w:val="24"/>
+          <w:szCs w:val="24"/>
+        </w:rPr>
+      </w:pPr>
+      <w:r>
+        <w:rPr>
+          <w:rFonts w:ascii="Times New Roman" w:cs="Times New Roman" w:eastAsia="Times New Roman" w:hAnsi="Times New Roman"/>
+          <w:sz w:val="24"/>
+          <w:szCs w:val="24"/>
+          <w:rtl w:val="0"/>
+        </w:rPr>
+        <w:t xml:space="preserve">WASTE IND</w:t>
+        <w:tab/>
+        <w:tab/>
+        <w:tab/>
+        <w:t xml:space="preserve">1,139</w:t>
+        <w:tab/>
+        <w:tab/>
+        <w:tab/>
+        <w:t xml:space="preserve">6.99%</w:t>
+        <w:tab/>
+        <w:tab/>
+        <w:tab/>
+        <w:tab/>
+        <w:t xml:space="preserve">$146,000</w:t>
+      </w:r>
+    </w:p>
+    <w:p>
+      <w:pPr>
+        <w:rPr>
+          <w:rFonts w:ascii="Times New Roman" w:cs="Times New Roman" w:eastAsia="Times New Roman" w:hAnsi="Times New Roman"/>
+          <w:sz w:val="24"/>
+          <w:szCs w:val="24"/>
+        </w:rPr>
+      </w:pPr>
+      <w:r>
+        <w:rPr>
+          <w:rFonts w:ascii="Times New Roman" w:cs="Times New Roman" w:eastAsia="Times New Roman" w:hAnsi="Times New Roman"/>
+          <w:sz w:val="24"/>
+          <w:szCs w:val="24"/>
+          <w:rtl w:val="0"/>
+        </w:rPr>
+        <w:t xml:space="preserve">Total</w:t>
+        <w:tab/>
+        <w:tab/>
+        <w:tab/>
+        <w:tab/>
+        <w:t xml:space="preserve">17,080</w:t>
+        <w:tab/>
+        <w:tab/>
+        <w:tab/>
+        <w:t xml:space="preserve">100.00%</w:t>
+        <w:tab/>
+        <w:tab/>
+        <w:tab/>
+        <w:t xml:space="preserve">$2,488,500</w:t>
+      </w:r>
+    </w:p>
+    <w:p>
+      <w:pPr>
+        <w:rPr>
+          <w:rFonts w:ascii="Times New Roman" w:cs="Times New Roman" w:eastAsia="Times New Roman" w:hAnsi="Times New Roman"/>
+          <w:sz w:val="24"/>
+          <w:szCs w:val="24"/>
+        </w:rPr>
+      </w:pPr>
+      <w:r>
+        <w:rPr>
+          <w:rtl w:val="0"/>
+        </w:rPr>
+      </w:r>
+    </w:p>
+    <w:p>
+      <w:pPr>
+        <w:rPr>
+          <w:rFonts w:ascii="Times New Roman" w:cs="Times New Roman" w:eastAsia="Times New Roman" w:hAnsi="Times New Roman"/>
+          <w:sz w:val="24"/>
+          <w:szCs w:val="24"/>
+        </w:rPr>
+      </w:pPr>
+      <w:r>
+        <w:rPr>
+          <w:rFonts w:ascii="Gungsuh" w:cs="Gungsuh" w:eastAsia="Gungsuh" w:hAnsi="Gungsuh"/>
+          <w:sz w:val="24"/>
+          <w:szCs w:val="24"/>
+          <w:rtl w:val="0"/>
+        </w:rPr>
+        <w:t xml:space="preserve">Method: grouped Trues by (Incident Address, Trash Hauler) pair; each group with ≥2 Trues incurs (count − 1) × $500. METRO and Metro combined. % of Requests is each hauler's share of all rows with a hauler assigned (19,325 rows; ~900 rows had a blank hauler and were excluded from the denominator).</w:t>
+      </w:r>
+    </w:p>
+    <w:p>
+      <w:pPr>
+        <w:rPr>
+          <w:rFonts w:ascii="Times New Roman" w:cs="Times New Roman" w:eastAsia="Times New Roman" w:hAnsi="Times New Roman"/>
+          <w:i w:val="1"/>
+          <w:iCs w:val="1"/>
+          <w:sz w:val="24"/>
+          <w:szCs w:val="24"/>
+        </w:rPr>
+      </w:pPr>
+      <w:r>
+        <w:rPr>
+          <w:rtl w:val="0"/>
+        </w:rPr>
+      </w:r>
+    </w:p>
+    <w:p>
+      <w:pPr>
+        <w:rPr>
+          <w:rFonts w:ascii="Times New Roman" w:cs="Times New Roman" w:eastAsia="Times New Roman" w:hAnsi="Times New Roman"/>
           <w:i w:val="1"/>
           <w:iCs w:val="1"/>
           <w:sz w:val="24"/>
@@ -3679,6 +4734,114 @@
       <w:pPr>
         <w:rPr>
           <w:rFonts w:ascii="Times New Roman" w:cs="Times New Roman" w:eastAsia="Times New Roman" w:hAnsi="Times New Roman"/>
+          <w:b w:val="1"/>
+          <w:bCs w:val="1"/>
+          <w:sz w:val="24"/>
+          <w:szCs w:val="24"/>
+        </w:rPr>
+      </w:pPr>
+      <w:r>
+        <w:rPr>
+          <w:rFonts w:ascii="Times New Roman" w:cs="Times New Roman" w:eastAsia="Times New Roman" w:hAnsi="Times New Roman"/>
+          <w:b w:val="1"/>
+          <w:bCs w:val="1"/>
+          <w:sz w:val="24"/>
+          <w:szCs w:val="24"/>
+          <w:rtl w:val="0"/>
+        </w:rPr>
+        <w:t xml:space="preserve">Q. How many days are covered in this data?</w:t>
+      </w:r>
+    </w:p>
+    <w:p>
+      <w:pPr>
+        <w:rPr>
+          <w:rFonts w:ascii="Times New Roman" w:cs="Times New Roman" w:eastAsia="Times New Roman" w:hAnsi="Times New Roman"/>
+          <w:b w:val="1"/>
+          <w:bCs w:val="1"/>
+          <w:sz w:val="24"/>
+          <w:szCs w:val="24"/>
+        </w:rPr>
+      </w:pPr>
+      <w:r>
+        <w:rPr>
+          <w:rtl w:val="0"/>
+        </w:rPr>
+      </w:r>
+    </w:p>
+    <w:p>
+      <w:pPr>
+        <w:rPr>
+          <w:rFonts w:ascii="Times New Roman" w:cs="Times New Roman" w:eastAsia="Times New Roman" w:hAnsi="Times New Roman"/>
+          <w:sz w:val="24"/>
+          <w:szCs w:val="24"/>
+        </w:rPr>
+      </w:pPr>
+      <w:r>
+        <w:rPr>
+          <w:rFonts w:ascii="Cardo" w:cs="Cardo" w:eastAsia="Cardo" w:hAnsi="Cardo"/>
+          <w:sz w:val="24"/>
+          <w:szCs w:val="24"/>
+          <w:rtl w:val="0"/>
+        </w:rPr>
+        <w:t xml:space="preserve">A. Date range: 2017-11-01 → 2019-11-01 (731 calendar days, ~2 years)</w:t>
+      </w:r>
+    </w:p>
+    <w:p>
+      <w:pPr>
+        <w:rPr>
+          <w:rFonts w:ascii="Times New Roman" w:cs="Times New Roman" w:eastAsia="Times New Roman" w:hAnsi="Times New Roman"/>
+          <w:sz w:val="24"/>
+          <w:szCs w:val="24"/>
+        </w:rPr>
+      </w:pPr>
+      <w:r>
+        <w:rPr>
+          <w:rFonts w:ascii="Times New Roman" w:cs="Times New Roman" w:eastAsia="Times New Roman" w:hAnsi="Times New Roman"/>
+          <w:sz w:val="24"/>
+          <w:szCs w:val="24"/>
+          <w:rtl w:val="0"/>
+        </w:rPr>
+        <w:t xml:space="preserve">Distinct days with at least one complaint: 686</w:t>
+      </w:r>
+    </w:p>
+    <w:p>
+      <w:pPr>
+        <w:rPr>
+          <w:rFonts w:ascii="Times New Roman" w:cs="Times New Roman" w:eastAsia="Times New Roman" w:hAnsi="Times New Roman"/>
+          <w:sz w:val="24"/>
+          <w:szCs w:val="24"/>
+        </w:rPr>
+      </w:pPr>
+      <w:r>
+        <w:rPr>
+          <w:rFonts w:ascii="Times New Roman" w:cs="Times New Roman" w:eastAsia="Times New Roman" w:hAnsi="Times New Roman"/>
+          <w:sz w:val="24"/>
+          <w:szCs w:val="24"/>
+          <w:rtl w:val="0"/>
+        </w:rPr>
+        <w:t xml:space="preserve">So 45 days in that window had no complaints logged.</w:t>
+      </w:r>
+    </w:p>
+    <w:p>
+      <w:pPr>
+        <w:rPr>
+          <w:rFonts w:ascii="Times New Roman" w:cs="Times New Roman" w:eastAsia="Times New Roman" w:hAnsi="Times New Roman"/>
+          <w:i w:val="1"/>
+          <w:iCs w:val="1"/>
+          <w:sz w:val="24"/>
+          <w:szCs w:val="24"/>
+        </w:rPr>
+      </w:pPr>
+      <w:r>
+        <w:rPr>
+          <w:rtl w:val="0"/>
+        </w:rPr>
+      </w:r>
+    </w:p>
+    <w:p>
+      <w:pPr>
+        <w:rPr>
+          <w:rFonts w:ascii="Times New Roman" w:cs="Times New Roman" w:eastAsia="Times New Roman" w:hAnsi="Times New Roman"/>
           <w:i w:val="1"/>
           <w:iCs w:val="1"/>
           <w:sz w:val="24"/>
@@ -3695,6 +4858,116 @@
           <w:rtl w:val="0"/>
         </w:rPr>
         <w:t xml:space="preserve">Next ask Claude to make a dashboard for you choosing whichever metrics it thinks are more important.</w:t>
+      </w:r>
+    </w:p>
+    <w:p>
+      <w:pPr>
+        <w:rPr>
+          <w:rFonts w:ascii="Times New Roman" w:cs="Times New Roman" w:eastAsia="Times New Roman" w:hAnsi="Times New Roman"/>
+          <w:i w:val="1"/>
+          <w:iCs w:val="1"/>
+          <w:sz w:val="24"/>
+          <w:szCs w:val="24"/>
+        </w:rPr>
+      </w:pPr>
+      <w:r>
+        <w:rPr>
+          <w:rtl w:val="0"/>
+        </w:rPr>
+      </w:r>
+    </w:p>
+    <w:p>
+      <w:pPr>
+        <w:rPr>
+          <w:rFonts w:ascii="Times New Roman" w:cs="Times New Roman" w:eastAsia="Times New Roman" w:hAnsi="Times New Roman"/>
+          <w:b w:val="1"/>
+          <w:bCs w:val="1"/>
+          <w:sz w:val="24"/>
+          <w:szCs w:val="24"/>
+        </w:rPr>
+      </w:pPr>
+      <w:r>
+        <w:rPr>
+          <w:rFonts w:ascii="Times New Roman" w:cs="Times New Roman" w:eastAsia="Times New Roman" w:hAnsi="Times New Roman"/>
+          <w:b w:val="1"/>
+          <w:bCs w:val="1"/>
+          <w:sz w:val="24"/>
+          <w:szCs w:val="24"/>
+          <w:rtl w:val="0"/>
+        </w:rPr>
+        <w:t xml:space="preserve">Q. Make me a pretty dashboard that is color coordinated with important metrics from this data. </w:t>
+      </w:r>
+    </w:p>
+    <w:p>
+      <w:pPr>
+        <w:rPr>
+          <w:rFonts w:ascii="Times New Roman" w:cs="Times New Roman" w:eastAsia="Times New Roman" w:hAnsi="Times New Roman"/>
+          <w:b w:val="1"/>
+          <w:bCs w:val="1"/>
+          <w:sz w:val="24"/>
+          <w:szCs w:val="24"/>
+        </w:rPr>
+      </w:pPr>
+      <w:r>
+        <w:rPr>
+          <w:rtl w:val="0"/>
+        </w:rPr>
+      </w:r>
+    </w:p>
+    <w:p>
+      <w:pPr>
+        <w:rPr>
+          <w:rFonts w:ascii="Times New Roman" w:cs="Times New Roman" w:eastAsia="Times New Roman" w:hAnsi="Times New Roman"/>
+          <w:b w:val="1"/>
+          <w:bCs w:val="1"/>
+          <w:sz w:val="24"/>
+          <w:szCs w:val="24"/>
+        </w:rPr>
+      </w:pPr>
+      <w:r>
+        <w:rPr>
+          <w:rFonts w:ascii="Times New Roman" w:cs="Times New Roman" w:eastAsia="Times New Roman" w:hAnsi="Times New Roman"/>
+          <w:b w:val="1"/>
+          <w:bCs w:val="1"/>
+          <w:sz w:val="24"/>
+          <w:szCs w:val="24"/>
+          <w:rtl w:val="0"/>
+        </w:rPr>
+        <w:t xml:space="preserve">I got hit with a “Claude is experiencing a high demand” alert.</w:t>
+      </w:r>
+    </w:p>
+    <w:p>
+      <w:pPr>
+        <w:rPr>
+          <w:rFonts w:ascii="Times New Roman" w:cs="Times New Roman" w:eastAsia="Times New Roman" w:hAnsi="Times New Roman"/>
+          <w:b w:val="1"/>
+          <w:bCs w:val="1"/>
+          <w:sz w:val="24"/>
+          <w:szCs w:val="24"/>
+        </w:rPr>
+      </w:pPr>
+      <w:r>
+        <w:rPr>
+          <w:rtl w:val="0"/>
+        </w:rPr>
+      </w:r>
+    </w:p>
+    <w:p>
+      <w:pPr>
+        <w:rPr>
+          <w:rFonts w:ascii="Times New Roman" w:cs="Times New Roman" w:eastAsia="Times New Roman" w:hAnsi="Times New Roman"/>
+          <w:sz w:val="24"/>
+          <w:szCs w:val="24"/>
+        </w:rPr>
+      </w:pPr>
+      <w:r>
+        <w:rPr>
+          <w:rFonts w:ascii="Times New Roman" w:cs="Times New Roman" w:eastAsia="Times New Roman" w:hAnsi="Times New Roman"/>
+          <w:sz w:val="24"/>
+          <w:szCs w:val="24"/>
+          <w:rtl w:val="0"/>
+        </w:rPr>
+        <w:t xml:space="preserve">A. </w:t>
       </w:r>
     </w:p>
     <w:p>

</xml_diff>

<commit_message>
Finished Q&A with Claude. Includes all prompts asked and answers given.
</commit_message>
<xml_diff>
--- a/docs/trash_haulers_claude_Q&A.docx
+++ b/docs/trash_haulers_claude_Q&A.docx
@@ -4967,7 +4967,282 @@
           <w:szCs w:val="24"/>
           <w:rtl w:val="0"/>
         </w:rPr>
-        <w:t xml:space="preserve">A. </w:t>
+        <w:t xml:space="preserve">A. I'll build a dashboard sheet with KPIs, top haulers, top districts, and top addresses. Let me gather the remaining metrics I don't have yet, then assemble.</w:t>
+      </w:r>
+    </w:p>
+    <w:p>
+      <w:pPr>
+        <w:rPr>
+          <w:rFonts w:ascii="Times New Roman" w:cs="Times New Roman" w:eastAsia="Times New Roman" w:hAnsi="Times New Roman"/>
+          <w:sz w:val="24"/>
+          <w:szCs w:val="24"/>
+        </w:rPr>
+      </w:pPr>
+      <w:r>
+        <w:rPr>
+          <w:rFonts w:ascii="Times New Roman" w:cs="Times New Roman" w:eastAsia="Times New Roman" w:hAnsi="Times New Roman"/>
+          <w:sz w:val="24"/>
+          <w:szCs w:val="24"/>
+          <w:rtl w:val="0"/>
+        </w:rPr>
+        <w:t xml:space="preserve">Now I'll build the dashboard. Color palette: deep teal header (#0F4C5C), accent coral (#E36414), muted gold (#FB8B24), soft cream background (#FFF8E7), and slate text (#2A2A2A). The value range is 2 rows × 2 cols and I gave a 1×1 array — need to set the value before merge, or use the top-left cell after merge. Let me </w:t>
+      </w:r>
+      <w:r>
+        <w:rPr>
+          <w:rFonts w:ascii="Times New Roman" w:cs="Times New Roman" w:eastAsia="Times New Roman" w:hAnsi="Times New Roman"/>
+          <w:sz w:val="24"/>
+          <w:szCs w:val="24"/>
+          <w:rtl w:val="0"/>
+        </w:rPr>
+        <w:t xml:space="preserve">fix</w:t>
+      </w:r>
+      <w:r>
+        <w:rPr>
+          <w:rFonts w:ascii="Times New Roman" w:cs="Times New Roman" w:eastAsia="Times New Roman" w:hAnsi="Times New Roman"/>
+          <w:sz w:val="24"/>
+          <w:szCs w:val="24"/>
+          <w:rtl w:val="0"/>
+        </w:rPr>
+        <w:t xml:space="preserve">. </w:t>
+      </w:r>
+    </w:p>
+    <w:p>
+      <w:pPr>
+        <w:rPr>
+          <w:rFonts w:ascii="Times New Roman" w:cs="Times New Roman" w:eastAsia="Times New Roman" w:hAnsi="Times New Roman"/>
+          <w:sz w:val="24"/>
+          <w:szCs w:val="24"/>
+        </w:rPr>
+      </w:pPr>
+      <w:r>
+        <w:rPr>
+          <w:rFonts w:ascii="Times New Roman" w:cs="Times New Roman" w:eastAsia="Times New Roman" w:hAnsi="Times New Roman"/>
+          <w:sz w:val="24"/>
+          <w:szCs w:val="24"/>
+          <w:rtl w:val="0"/>
+        </w:rPr>
+        <w:t xml:space="preserve">Header banner in deep teal with date range</w:t>
+      </w:r>
+    </w:p>
+    <w:p>
+      <w:pPr>
+        <w:rPr>
+          <w:rFonts w:ascii="Times New Roman" w:cs="Times New Roman" w:eastAsia="Times New Roman" w:hAnsi="Times New Roman"/>
+          <w:sz w:val="24"/>
+          <w:szCs w:val="24"/>
+        </w:rPr>
+      </w:pPr>
+      <w:r>
+        <w:rPr>
+          <w:rFonts w:ascii="Times New Roman" w:cs="Times New Roman" w:eastAsia="Times New Roman" w:hAnsi="Times New Roman"/>
+          <w:sz w:val="24"/>
+          <w:szCs w:val="24"/>
+          <w:rtl w:val="0"/>
+        </w:rPr>
+        <w:t xml:space="preserve">4 KPI cards — Total Complaints, Missed Pickups, Missed %, Total Fines — each in its own accent color</w:t>
+      </w:r>
+    </w:p>
+    <w:p>
+      <w:pPr>
+        <w:rPr>
+          <w:rFonts w:ascii="Times New Roman" w:cs="Times New Roman" w:eastAsia="Times New Roman" w:hAnsi="Times New Roman"/>
+          <w:sz w:val="24"/>
+          <w:szCs w:val="24"/>
+        </w:rPr>
+      </w:pPr>
+      <w:r>
+        <w:rPr>
+          <w:rFonts w:ascii="Times New Roman" w:cs="Times New Roman" w:eastAsia="Times New Roman" w:hAnsi="Times New Roman"/>
+          <w:sz w:val="24"/>
+          <w:szCs w:val="24"/>
+          <w:rtl w:val="0"/>
+        </w:rPr>
+        <w:t xml:space="preserve">Fines by Trash Hauler with totals row</w:t>
+      </w:r>
+    </w:p>
+    <w:p>
+      <w:pPr>
+        <w:rPr>
+          <w:rFonts w:ascii="Times New Roman" w:cs="Times New Roman" w:eastAsia="Times New Roman" w:hAnsi="Times New Roman"/>
+          <w:sz w:val="24"/>
+          <w:szCs w:val="24"/>
+        </w:rPr>
+      </w:pPr>
+      <w:r>
+        <w:rPr>
+          <w:rFonts w:ascii="Times New Roman" w:cs="Times New Roman" w:eastAsia="Times New Roman" w:hAnsi="Times New Roman"/>
+          <w:sz w:val="24"/>
+          <w:szCs w:val="24"/>
+          <w:rtl w:val="0"/>
+        </w:rPr>
+        <w:t xml:space="preserve">Top 10 Districts by missed pickup count</w:t>
+      </w:r>
+    </w:p>
+    <w:p>
+      <w:pPr>
+        <w:rPr>
+          <w:rFonts w:ascii="Times New Roman" w:cs="Times New Roman" w:eastAsia="Times New Roman" w:hAnsi="Times New Roman"/>
+          <w:sz w:val="24"/>
+          <w:szCs w:val="24"/>
+        </w:rPr>
+      </w:pPr>
+      <w:r>
+        <w:rPr>
+          <w:rFonts w:ascii="Times New Roman" w:cs="Times New Roman" w:eastAsia="Times New Roman" w:hAnsi="Times New Roman"/>
+          <w:sz w:val="24"/>
+          <w:szCs w:val="24"/>
+          <w:rtl w:val="0"/>
+        </w:rPr>
+        <w:t xml:space="preserve">Top 10 Addresses with most missed pickups</w:t>
+      </w:r>
+    </w:p>
+    <w:p>
+      <w:pPr>
+        <w:rPr>
+          <w:rFonts w:ascii="Times New Roman" w:cs="Times New Roman" w:eastAsia="Times New Roman" w:hAnsi="Times New Roman"/>
+          <w:sz w:val="24"/>
+          <w:szCs w:val="24"/>
+        </w:rPr>
+      </w:pPr>
+      <w:r>
+        <w:rPr>
+          <w:rFonts w:ascii="Times New Roman" w:cs="Times New Roman" w:eastAsia="Times New Roman" w:hAnsi="Times New Roman"/>
+          <w:sz w:val="24"/>
+          <w:szCs w:val="24"/>
+          <w:rtl w:val="0"/>
+        </w:rPr>
+        <w:t xml:space="preserve">Request Types breakdown</w:t>
+      </w:r>
+    </w:p>
+    <w:p>
+      <w:pPr>
+        <w:rPr>
+          <w:rFonts w:ascii="Times New Roman" w:cs="Times New Roman" w:eastAsia="Times New Roman" w:hAnsi="Times New Roman"/>
+          <w:sz w:val="24"/>
+          <w:szCs w:val="24"/>
+        </w:rPr>
+      </w:pPr>
+      <w:r>
+        <w:rPr>
+          <w:rFonts w:ascii="Times New Roman" w:cs="Times New Roman" w:eastAsia="Times New Roman" w:hAnsi="Times New Roman"/>
+          <w:sz w:val="24"/>
+          <w:szCs w:val="24"/>
+          <w:rtl w:val="0"/>
+        </w:rPr>
+        <w:t xml:space="preserve">Monthly trend table + a line chart showing total vs. missed over time</w:t>
+      </w:r>
+    </w:p>
+    <w:p>
+      <w:pPr>
+        <w:rPr>
+          <w:rFonts w:ascii="Times New Roman" w:cs="Times New Roman" w:eastAsia="Times New Roman" w:hAnsi="Times New Roman"/>
+          <w:sz w:val="24"/>
+          <w:szCs w:val="24"/>
+        </w:rPr>
+      </w:pPr>
+      <w:r>
+        <w:rPr>
+          <w:rFonts w:ascii="Times New Roman" w:cs="Times New Roman" w:eastAsia="Times New Roman" w:hAnsi="Times New Roman"/>
+          <w:sz w:val="24"/>
+          <w:szCs w:val="24"/>
+          <w:rtl w:val="0"/>
+        </w:rPr>
+        <w:t xml:space="preserve">Color palette is teal/coral/gold/burgundy on a soft cream background, alternating row shading for the tables. Let me know if you want it rearranged, more metrics added, or the chart swapped for a different type.</w:t>
+      </w:r>
+    </w:p>
+    <w:p>
+      <w:pPr>
+        <w:rPr>
+          <w:rFonts w:ascii="Times New Roman" w:cs="Times New Roman" w:eastAsia="Times New Roman" w:hAnsi="Times New Roman"/>
+          <w:sz w:val="24"/>
+          <w:szCs w:val="24"/>
+        </w:rPr>
+      </w:pPr>
+      <w:r>
+        <w:rPr>
+          <w:rtl w:val="0"/>
+        </w:rPr>
+      </w:r>
+    </w:p>
+    <w:p>
+      <w:pPr>
+        <w:rPr>
+          <w:rFonts w:ascii="Times New Roman" w:cs="Times New Roman" w:eastAsia="Times New Roman" w:hAnsi="Times New Roman"/>
+          <w:sz w:val="24"/>
+          <w:szCs w:val="24"/>
+        </w:rPr>
+      </w:pPr>
+      <w:r>
+        <w:rPr>
+          <w:rtl w:val="0"/>
+        </w:rPr>
+      </w:r>
+    </w:p>
+    <w:p>
+      <w:pPr>
+        <w:rPr>
+          <w:rFonts w:ascii="Times New Roman" w:cs="Times New Roman" w:eastAsia="Times New Roman" w:hAnsi="Times New Roman"/>
+          <w:sz w:val="24"/>
+          <w:szCs w:val="24"/>
+        </w:rPr>
+      </w:pPr>
+      <w:r>
+        <w:rPr>
+          <w:rFonts w:ascii="Times New Roman" w:cs="Times New Roman" w:eastAsia="Times New Roman" w:hAnsi="Times New Roman"/>
+          <w:sz w:val="24"/>
+          <w:szCs w:val="24"/>
+        </w:rPr>
+        <w:drawing>
+          <wp:inline distB="114300" distT="114300" distL="114300" distR="114300">
+            <wp:extent cx="5681663" cy="4173083"/>
+            <wp:effectExtent b="0" l="0" r="0" t="0"/>
+            <wp:docPr id="1" name="image1.png"/>
+            <a:graphic>
+              <a:graphicData uri="http://schemas.openxmlformats.org/drawingml/2006/picture">
+                <pic:pic>
+                  <pic:nvPicPr>
+                    <pic:cNvPr id="0" name="image1.png"/>
+                    <pic:cNvPicPr preferRelativeResize="0"/>
+                  </pic:nvPicPr>
+                  <pic:blipFill>
+                    <a:blip r:embed="rId6"/>
+                    <a:srcRect b="0" l="0" r="0" t="0"/>
+                    <a:stretch>
+                      <a:fillRect/>
+                    </a:stretch>
+                  </pic:blipFill>
+                  <pic:spPr>
+                    <a:xfrm>
+                      <a:off x="0" y="0"/>
+                      <a:ext cx="5681663" cy="4173083"/>
+                    </a:xfrm>
+                    <a:prstGeom prst="rect"/>
+                    <a:ln/>
+                  </pic:spPr>
+                </pic:pic>
+              </a:graphicData>
+            </a:graphic>
+          </wp:inline>
+        </w:drawing>
+      </w:r>
+      <w:r>
+        <w:rPr>
+          <w:rtl w:val="0"/>
+        </w:rPr>
+      </w:r>
+    </w:p>
+    <w:p>
+      <w:pPr>
+        <w:rPr>
+          <w:rFonts w:ascii="Times New Roman" w:cs="Times New Roman" w:eastAsia="Times New Roman" w:hAnsi="Times New Roman"/>
+          <w:sz w:val="24"/>
+          <w:szCs w:val="24"/>
+        </w:rPr>
+      </w:pPr>
+      <w:r>
+        <w:rPr>
+          <w:rtl w:val="0"/>
+        </w:rPr>
       </w:r>
     </w:p>
     <w:p>
@@ -5012,6 +5287,44 @@
       <w:pPr>
         <w:rPr>
           <w:rFonts w:ascii="Times New Roman" w:cs="Times New Roman" w:eastAsia="Times New Roman" w:hAnsi="Times New Roman"/>
+          <w:b w:val="1"/>
+          <w:bCs w:val="1"/>
+          <w:sz w:val="24"/>
+          <w:szCs w:val="24"/>
+        </w:rPr>
+      </w:pPr>
+      <w:r>
+        <w:rPr>
+          <w:rFonts w:ascii="Times New Roman" w:cs="Times New Roman" w:eastAsia="Times New Roman" w:hAnsi="Times New Roman"/>
+          <w:b w:val="1"/>
+          <w:bCs w:val="1"/>
+          <w:sz w:val="24"/>
+          <w:szCs w:val="24"/>
+          <w:rtl w:val="0"/>
+        </w:rPr>
+        <w:t xml:space="preserve">It did, As far as I can check using SUM down rows, they are correct.</w:t>
+      </w:r>
+    </w:p>
+    <w:p>
+      <w:pPr>
+        <w:rPr>
+          <w:rFonts w:ascii="Times New Roman" w:cs="Times New Roman" w:eastAsia="Times New Roman" w:hAnsi="Times New Roman"/>
+          <w:i w:val="1"/>
+          <w:iCs w:val="1"/>
+          <w:sz w:val="24"/>
+          <w:szCs w:val="24"/>
+        </w:rPr>
+      </w:pPr>
+      <w:r>
+        <w:rPr>
+          <w:rtl w:val="0"/>
+        </w:rPr>
+      </w:r>
+    </w:p>
+    <w:p>
+      <w:pPr>
+        <w:rPr>
+          <w:rFonts w:ascii="Times New Roman" w:cs="Times New Roman" w:eastAsia="Times New Roman" w:hAnsi="Times New Roman"/>
           <w:i w:val="1"/>
           <w:iCs w:val="1"/>
           <w:sz w:val="24"/>
@@ -5050,6 +5363,28 @@
       <w:pPr>
         <w:rPr>
           <w:rFonts w:ascii="Times New Roman" w:cs="Times New Roman" w:eastAsia="Times New Roman" w:hAnsi="Times New Roman"/>
+          <w:b w:val="1"/>
+          <w:bCs w:val="1"/>
+          <w:sz w:val="24"/>
+          <w:szCs w:val="24"/>
+        </w:rPr>
+      </w:pPr>
+      <w:r>
+        <w:rPr>
+          <w:rFonts w:ascii="Times New Roman" w:cs="Times New Roman" w:eastAsia="Times New Roman" w:hAnsi="Times New Roman"/>
+          <w:b w:val="1"/>
+          <w:bCs w:val="1"/>
+          <w:sz w:val="24"/>
+          <w:szCs w:val="24"/>
+          <w:rtl w:val="0"/>
+        </w:rPr>
+        <w:t xml:space="preserve">The best aspect of this dashboard was how quickly it took to make. The numbers look accurate (needs to be double-checked of course), and the graph came out great.</w:t>
+      </w:r>
+    </w:p>
+    <w:p>
+      <w:pPr>
+        <w:rPr>
+          <w:rFonts w:ascii="Times New Roman" w:cs="Times New Roman" w:eastAsia="Times New Roman" w:hAnsi="Times New Roman"/>
           <w:i w:val="1"/>
           <w:iCs w:val="1"/>
           <w:sz w:val="24"/>
@@ -5088,6 +5423,28 @@
       <w:pPr>
         <w:rPr>
           <w:rFonts w:ascii="Times New Roman" w:cs="Times New Roman" w:eastAsia="Times New Roman" w:hAnsi="Times New Roman"/>
+          <w:b w:val="1"/>
+          <w:bCs w:val="1"/>
+          <w:sz w:val="24"/>
+          <w:szCs w:val="24"/>
+        </w:rPr>
+      </w:pPr>
+      <w:r>
+        <w:rPr>
+          <w:rFonts w:ascii="Times New Roman" w:cs="Times New Roman" w:eastAsia="Times New Roman" w:hAnsi="Times New Roman"/>
+          <w:b w:val="1"/>
+          <w:bCs w:val="1"/>
+          <w:sz w:val="24"/>
+          <w:szCs w:val="24"/>
+          <w:rtl w:val="0"/>
+        </w:rPr>
+        <w:t xml:space="preserve">Claude lacks the thinking ability of deriving context. It chose to make a dashboard focusing on basic business powerpoint ideas instead of the metrics that are more pertinent to this particular data. Its dashboard is also incredibly basic and doesn’t look great to the human eye, even after telling it to use good color techniques. </w:t>
+      </w:r>
+    </w:p>
+    <w:p>
+      <w:pPr>
+        <w:rPr>
+          <w:rFonts w:ascii="Times New Roman" w:cs="Times New Roman" w:eastAsia="Times New Roman" w:hAnsi="Times New Roman"/>
           <w:i w:val="1"/>
           <w:iCs w:val="1"/>
           <w:sz w:val="24"/>
@@ -5120,6 +5477,28 @@
           <w:rtl w:val="0"/>
         </w:rPr>
         <w:t xml:space="preserve">Could this dashboard be a good starting point to improve upon it or would it be better just to create your own from scratch?</w:t>
+      </w:r>
+    </w:p>
+    <w:p>
+      <w:pPr>
+        <w:rPr>
+          <w:rFonts w:ascii="Times New Roman" w:cs="Times New Roman" w:eastAsia="Times New Roman" w:hAnsi="Times New Roman"/>
+          <w:b w:val="1"/>
+          <w:bCs w:val="1"/>
+          <w:sz w:val="24"/>
+          <w:szCs w:val="24"/>
+        </w:rPr>
+      </w:pPr>
+      <w:r>
+        <w:rPr>
+          <w:rFonts w:ascii="Times New Roman" w:cs="Times New Roman" w:eastAsia="Times New Roman" w:hAnsi="Times New Roman"/>
+          <w:b w:val="1"/>
+          <w:bCs w:val="1"/>
+          <w:sz w:val="24"/>
+          <w:szCs w:val="24"/>
+          <w:rtl w:val="0"/>
+        </w:rPr>
+        <w:t xml:space="preserve">This would make for a good starting point to get a sense of the numbers to use. Though it would probably be better to have Claude create better organization of the data for you to then use to make a dashboard yourself, as a human dashboard will look cleaner and more aesthetic. Going straight from scratch may be better than presenting this outright with no edits.</w:t>
       </w:r>
     </w:p>
     <w:sectPr>

</xml_diff>